<commit_message>
feat: layout sidebar updates & notifikasi
</commit_message>
<xml_diff>
--- a/public/assets/BERITA ACARA SERAH TERIMA BARANG.docx
+++ b/public/assets/BERITA ACARA SERAH TERIMA BARANG.docx
@@ -34,7 +34,27 @@
           <w:szCs w:val="28"/>
           <w:u w:val="single"/>
         </w:rPr>
-        <w:t>PENGADAAN/PEROLEHAN</w:t>
+        <w:t>DISTRIBUSI</w:t>
+      </w:r>
+      <w:r>
+        <w:rPr>
+          <w:b/>
+          <w:bCs/>
+          <w:sz w:val="28"/>
+          <w:szCs w:val="28"/>
+          <w:u w:val="single"/>
+        </w:rPr>
+        <w:t>/</w:t>
+      </w:r>
+      <w:r>
+        <w:rPr>
+          <w:b/>
+          <w:bCs/>
+          <w:sz w:val="28"/>
+          <w:szCs w:val="28"/>
+          <w:u w:val="single"/>
+        </w:rPr>
+        <w:t>PENGELUARAN</w:t>
       </w:r>
       <w:r>
         <w:rPr>
@@ -163,10 +183,7 @@
       </w:r>
       <w:proofErr w:type="gramStart"/>
       <w:r>
-        <w:t>…</w:t>
-      </w:r>
-      <w:r>
-        <w:t>(</w:t>
+        <w:t>…(</w:t>
       </w:r>
       <w:proofErr w:type="gramEnd"/>
       <w:r>
@@ -417,18 +434,14 @@
     <w:tbl>
       <w:tblPr>
         <w:tblStyle w:val="TableGrid"/>
-        <w:tblW w:w="9299" w:type="dxa"/>
+        <w:tblW w:w="5345" w:type="dxa"/>
         <w:tblLook w:val="04A0" w:firstRow="1" w:lastRow="0" w:firstColumn="1" w:lastColumn="0" w:noHBand="0" w:noVBand="1"/>
       </w:tblPr>
       <w:tblGrid>
         <w:gridCol w:w="623"/>
         <w:gridCol w:w="1156"/>
-        <w:gridCol w:w="1007"/>
-        <w:gridCol w:w="1007"/>
         <w:gridCol w:w="1068"/>
         <w:gridCol w:w="1022"/>
-        <w:gridCol w:w="861"/>
-        <w:gridCol w:w="1079"/>
         <w:gridCol w:w="1476"/>
       </w:tblGrid>
       <w:tr>
@@ -457,7 +470,7 @@
         </w:tc>
         <w:tc>
           <w:tcPr>
-            <w:tcW w:w="1157" w:type="dxa"/>
+            <w:tcW w:w="1156" w:type="dxa"/>
           </w:tcPr>
           <w:p>
             <w:pPr>
@@ -486,72 +499,6 @@
               </w:rPr>
               <w:t xml:space="preserve"> Nama Barang</w:t>
             </w:r>
-          </w:p>
-        </w:tc>
-        <w:tc>
-          <w:tcPr>
-            <w:tcW w:w="1007" w:type="dxa"/>
-          </w:tcPr>
-          <w:p>
-            <w:pPr>
-              <w:jc w:val="center"/>
-              <w:rPr>
-                <w:b/>
-                <w:bCs/>
-                <w:bdr w:val="single" w:sz="4" w:space="0" w:color="auto"/>
-              </w:rPr>
-            </w:pPr>
-            <w:r>
-              <w:rPr>
-                <w:b/>
-                <w:bCs/>
-                <w:bdr w:val="single" w:sz="4" w:space="0" w:color="auto"/>
-              </w:rPr>
-              <w:t xml:space="preserve">Harga </w:t>
-            </w:r>
-            <w:r>
-              <w:rPr>
-                <w:b/>
-                <w:bCs/>
-                <w:bdr w:val="single" w:sz="4" w:space="0" w:color="auto"/>
-              </w:rPr>
-              <w:br/>
-            </w:r>
-            <w:proofErr w:type="spellStart"/>
-            <w:r>
-              <w:rPr>
-                <w:b/>
-                <w:bCs/>
-                <w:bdr w:val="single" w:sz="4" w:space="0" w:color="auto"/>
-              </w:rPr>
-              <w:t>Satuan</w:t>
-            </w:r>
-            <w:proofErr w:type="spellEnd"/>
-          </w:p>
-        </w:tc>
-        <w:tc>
-          <w:tcPr>
-            <w:tcW w:w="1007" w:type="dxa"/>
-          </w:tcPr>
-          <w:p>
-            <w:pPr>
-              <w:jc w:val="center"/>
-              <w:rPr>
-                <w:b/>
-                <w:bCs/>
-                <w:bdr w:val="single" w:sz="4" w:space="0" w:color="auto"/>
-              </w:rPr>
-            </w:pPr>
-            <w:proofErr w:type="spellStart"/>
-            <w:r>
-              <w:rPr>
-                <w:b/>
-                <w:bCs/>
-                <w:bdr w:val="single" w:sz="4" w:space="0" w:color="auto"/>
-              </w:rPr>
-              <w:t>Satuan</w:t>
-            </w:r>
-            <w:proofErr w:type="spellEnd"/>
           </w:p>
         </w:tc>
         <w:tc>
@@ -567,14 +514,16 @@
                 <w:bdr w:val="single" w:sz="4" w:space="0" w:color="auto"/>
               </w:rPr>
             </w:pPr>
+            <w:proofErr w:type="spellStart"/>
             <w:r>
               <w:rPr>
                 <w:b/>
                 <w:bCs/>
                 <w:bdr w:val="single" w:sz="4" w:space="0" w:color="auto"/>
               </w:rPr>
-              <w:t>Volume</w:t>
+              <w:t>Satuan</w:t>
             </w:r>
+            <w:proofErr w:type="spellEnd"/>
           </w:p>
         </w:tc>
         <w:tc>
@@ -604,80 +553,7 @@
         </w:tc>
         <w:tc>
           <w:tcPr>
-            <w:tcW w:w="861" w:type="dxa"/>
-          </w:tcPr>
-          <w:p>
-            <w:pPr>
-              <w:jc w:val="center"/>
-              <w:rPr>
-                <w:b/>
-                <w:bCs/>
-                <w:bdr w:val="single" w:sz="4" w:space="0" w:color="auto"/>
-              </w:rPr>
-            </w:pPr>
-            <w:r>
-              <w:rPr>
-                <w:b/>
-                <w:bCs/>
-                <w:bdr w:val="single" w:sz="4" w:space="0" w:color="auto"/>
-              </w:rPr>
-              <w:t>PPN</w:t>
-            </w:r>
-          </w:p>
-          <w:p>
-            <w:pPr>
-              <w:jc w:val="center"/>
-              <w:rPr>
-                <w:b/>
-                <w:bCs/>
-                <w:bdr w:val="single" w:sz="4" w:space="0" w:color="auto"/>
-              </w:rPr>
-            </w:pPr>
-            <w:r>
-              <w:rPr>
-                <w:b/>
-                <w:bCs/>
-                <w:bdr w:val="single" w:sz="4" w:space="0" w:color="auto"/>
-              </w:rPr>
-              <w:t>(10%)</w:t>
-            </w:r>
-          </w:p>
-        </w:tc>
-        <w:tc>
-          <w:tcPr>
-            <w:tcW w:w="1079" w:type="dxa"/>
-          </w:tcPr>
-          <w:p>
-            <w:pPr>
-              <w:jc w:val="center"/>
-              <w:rPr>
-                <w:b/>
-                <w:bCs/>
-                <w:bdr w:val="single" w:sz="4" w:space="0" w:color="auto"/>
-              </w:rPr>
-            </w:pPr>
-            <w:r>
-              <w:rPr>
-                <w:b/>
-                <w:bCs/>
-                <w:bdr w:val="single" w:sz="4" w:space="0" w:color="auto"/>
-              </w:rPr>
-              <w:t>Harga Setelah</w:t>
-            </w:r>
-            <w:r>
-              <w:rPr>
-                <w:b/>
-                <w:bCs/>
-                <w:bdr w:val="single" w:sz="4" w:space="0" w:color="auto"/>
-              </w:rPr>
-              <w:br/>
-              <w:t>Pajak</w:t>
-            </w:r>
-          </w:p>
-        </w:tc>
-        <w:tc>
-          <w:tcPr>
-            <w:tcW w:w="1475" w:type="dxa"/>
+            <w:tcW w:w="1476" w:type="dxa"/>
           </w:tcPr>
           <w:p>
             <w:pPr>
@@ -718,35 +594,7 @@
         </w:tc>
         <w:tc>
           <w:tcPr>
-            <w:tcW w:w="1157" w:type="dxa"/>
-          </w:tcPr>
-          <w:p>
-            <w:pPr>
-              <w:rPr>
-                <w:sz w:val="28"/>
-                <w:szCs w:val="28"/>
-                <w:bdr w:val="single" w:sz="4" w:space="0" w:color="auto"/>
-              </w:rPr>
-            </w:pPr>
-          </w:p>
-        </w:tc>
-        <w:tc>
-          <w:tcPr>
-            <w:tcW w:w="1007" w:type="dxa"/>
-          </w:tcPr>
-          <w:p>
-            <w:pPr>
-              <w:rPr>
-                <w:sz w:val="28"/>
-                <w:szCs w:val="28"/>
-                <w:bdr w:val="single" w:sz="4" w:space="0" w:color="auto"/>
-              </w:rPr>
-            </w:pPr>
-          </w:p>
-        </w:tc>
-        <w:tc>
-          <w:tcPr>
-            <w:tcW w:w="1007" w:type="dxa"/>
+            <w:tcW w:w="1156" w:type="dxa"/>
           </w:tcPr>
           <w:p>
             <w:pPr>
@@ -788,35 +636,7 @@
         </w:tc>
         <w:tc>
           <w:tcPr>
-            <w:tcW w:w="861" w:type="dxa"/>
-          </w:tcPr>
-          <w:p>
-            <w:pPr>
-              <w:rPr>
-                <w:sz w:val="28"/>
-                <w:szCs w:val="28"/>
-                <w:bdr w:val="single" w:sz="4" w:space="0" w:color="auto"/>
-              </w:rPr>
-            </w:pPr>
-          </w:p>
-        </w:tc>
-        <w:tc>
-          <w:tcPr>
-            <w:tcW w:w="1079" w:type="dxa"/>
-          </w:tcPr>
-          <w:p>
-            <w:pPr>
-              <w:rPr>
-                <w:sz w:val="28"/>
-                <w:szCs w:val="28"/>
-                <w:bdr w:val="single" w:sz="4" w:space="0" w:color="auto"/>
-              </w:rPr>
-            </w:pPr>
-          </w:p>
-        </w:tc>
-        <w:tc>
-          <w:tcPr>
-            <w:tcW w:w="1475" w:type="dxa"/>
+            <w:tcW w:w="1476" w:type="dxa"/>
           </w:tcPr>
           <w:p>
             <w:pPr>
@@ -846,35 +666,7 @@
         </w:tc>
         <w:tc>
           <w:tcPr>
-            <w:tcW w:w="1157" w:type="dxa"/>
-          </w:tcPr>
-          <w:p>
-            <w:pPr>
-              <w:rPr>
-                <w:sz w:val="28"/>
-                <w:szCs w:val="28"/>
-                <w:bdr w:val="single" w:sz="4" w:space="0" w:color="auto"/>
-              </w:rPr>
-            </w:pPr>
-          </w:p>
-        </w:tc>
-        <w:tc>
-          <w:tcPr>
-            <w:tcW w:w="1007" w:type="dxa"/>
-          </w:tcPr>
-          <w:p>
-            <w:pPr>
-              <w:rPr>
-                <w:sz w:val="28"/>
-                <w:szCs w:val="28"/>
-                <w:bdr w:val="single" w:sz="4" w:space="0" w:color="auto"/>
-              </w:rPr>
-            </w:pPr>
-          </w:p>
-        </w:tc>
-        <w:tc>
-          <w:tcPr>
-            <w:tcW w:w="1007" w:type="dxa"/>
+            <w:tcW w:w="1156" w:type="dxa"/>
           </w:tcPr>
           <w:p>
             <w:pPr>
@@ -916,35 +708,7 @@
         </w:tc>
         <w:tc>
           <w:tcPr>
-            <w:tcW w:w="861" w:type="dxa"/>
-          </w:tcPr>
-          <w:p>
-            <w:pPr>
-              <w:rPr>
-                <w:sz w:val="28"/>
-                <w:szCs w:val="28"/>
-                <w:bdr w:val="single" w:sz="4" w:space="0" w:color="auto"/>
-              </w:rPr>
-            </w:pPr>
-          </w:p>
-        </w:tc>
-        <w:tc>
-          <w:tcPr>
-            <w:tcW w:w="1079" w:type="dxa"/>
-          </w:tcPr>
-          <w:p>
-            <w:pPr>
-              <w:rPr>
-                <w:sz w:val="28"/>
-                <w:szCs w:val="28"/>
-                <w:bdr w:val="single" w:sz="4" w:space="0" w:color="auto"/>
-              </w:rPr>
-            </w:pPr>
-          </w:p>
-        </w:tc>
-        <w:tc>
-          <w:tcPr>
-            <w:tcW w:w="1475" w:type="dxa"/>
+            <w:tcW w:w="1476" w:type="dxa"/>
           </w:tcPr>
           <w:p>
             <w:pPr>
@@ -974,35 +738,7 @@
         </w:tc>
         <w:tc>
           <w:tcPr>
-            <w:tcW w:w="1157" w:type="dxa"/>
-          </w:tcPr>
-          <w:p>
-            <w:pPr>
-              <w:rPr>
-                <w:sz w:val="28"/>
-                <w:szCs w:val="28"/>
-                <w:bdr w:val="single" w:sz="4" w:space="0" w:color="auto"/>
-              </w:rPr>
-            </w:pPr>
-          </w:p>
-        </w:tc>
-        <w:tc>
-          <w:tcPr>
-            <w:tcW w:w="1007" w:type="dxa"/>
-          </w:tcPr>
-          <w:p>
-            <w:pPr>
-              <w:rPr>
-                <w:sz w:val="28"/>
-                <w:szCs w:val="28"/>
-                <w:bdr w:val="single" w:sz="4" w:space="0" w:color="auto"/>
-              </w:rPr>
-            </w:pPr>
-          </w:p>
-        </w:tc>
-        <w:tc>
-          <w:tcPr>
-            <w:tcW w:w="1007" w:type="dxa"/>
+            <w:tcW w:w="1156" w:type="dxa"/>
           </w:tcPr>
           <w:p>
             <w:pPr>
@@ -1044,35 +780,7 @@
         </w:tc>
         <w:tc>
           <w:tcPr>
-            <w:tcW w:w="861" w:type="dxa"/>
-          </w:tcPr>
-          <w:p>
-            <w:pPr>
-              <w:rPr>
-                <w:sz w:val="28"/>
-                <w:szCs w:val="28"/>
-                <w:bdr w:val="single" w:sz="4" w:space="0" w:color="auto"/>
-              </w:rPr>
-            </w:pPr>
-          </w:p>
-        </w:tc>
-        <w:tc>
-          <w:tcPr>
-            <w:tcW w:w="1079" w:type="dxa"/>
-          </w:tcPr>
-          <w:p>
-            <w:pPr>
-              <w:rPr>
-                <w:sz w:val="28"/>
-                <w:szCs w:val="28"/>
-                <w:bdr w:val="single" w:sz="4" w:space="0" w:color="auto"/>
-              </w:rPr>
-            </w:pPr>
-          </w:p>
-        </w:tc>
-        <w:tc>
-          <w:tcPr>
-            <w:tcW w:w="1475" w:type="dxa"/>
+            <w:tcW w:w="1476" w:type="dxa"/>
           </w:tcPr>
           <w:p>
             <w:pPr>
@@ -1102,35 +810,7 @@
         </w:tc>
         <w:tc>
           <w:tcPr>
-            <w:tcW w:w="1157" w:type="dxa"/>
-          </w:tcPr>
-          <w:p>
-            <w:pPr>
-              <w:rPr>
-                <w:sz w:val="28"/>
-                <w:szCs w:val="28"/>
-                <w:bdr w:val="single" w:sz="4" w:space="0" w:color="auto"/>
-              </w:rPr>
-            </w:pPr>
-          </w:p>
-        </w:tc>
-        <w:tc>
-          <w:tcPr>
-            <w:tcW w:w="1007" w:type="dxa"/>
-          </w:tcPr>
-          <w:p>
-            <w:pPr>
-              <w:rPr>
-                <w:sz w:val="28"/>
-                <w:szCs w:val="28"/>
-                <w:bdr w:val="single" w:sz="4" w:space="0" w:color="auto"/>
-              </w:rPr>
-            </w:pPr>
-          </w:p>
-        </w:tc>
-        <w:tc>
-          <w:tcPr>
-            <w:tcW w:w="1007" w:type="dxa"/>
+            <w:tcW w:w="1156" w:type="dxa"/>
           </w:tcPr>
           <w:p>
             <w:pPr>
@@ -1172,84 +852,7 @@
         </w:tc>
         <w:tc>
           <w:tcPr>
-            <w:tcW w:w="861" w:type="dxa"/>
-          </w:tcPr>
-          <w:p>
-            <w:pPr>
-              <w:rPr>
-                <w:sz w:val="28"/>
-                <w:szCs w:val="28"/>
-                <w:bdr w:val="single" w:sz="4" w:space="0" w:color="auto"/>
-              </w:rPr>
-            </w:pPr>
-          </w:p>
-        </w:tc>
-        <w:tc>
-          <w:tcPr>
-            <w:tcW w:w="1079" w:type="dxa"/>
-          </w:tcPr>
-          <w:p>
-            <w:pPr>
-              <w:rPr>
-                <w:sz w:val="28"/>
-                <w:szCs w:val="28"/>
-                <w:bdr w:val="single" w:sz="4" w:space="0" w:color="auto"/>
-              </w:rPr>
-            </w:pPr>
-          </w:p>
-        </w:tc>
-        <w:tc>
-          <w:tcPr>
-            <w:tcW w:w="1475" w:type="dxa"/>
-          </w:tcPr>
-          <w:p>
-            <w:pPr>
-              <w:rPr>
-                <w:sz w:val="28"/>
-                <w:szCs w:val="28"/>
-                <w:bdr w:val="single" w:sz="4" w:space="0" w:color="auto"/>
-              </w:rPr>
-            </w:pPr>
-          </w:p>
-        </w:tc>
-      </w:tr>
-      <w:tr>
-        <w:tblPrEx>
-          <w:tblLook w:val="0000" w:firstRow="0" w:lastRow="0" w:firstColumn="0" w:lastColumn="0" w:noHBand="0" w:noVBand="0"/>
-        </w:tblPrEx>
-        <w:trPr>
-          <w:trHeight w:val="520"/>
-        </w:trPr>
-        <w:tc>
-          <w:tcPr>
-            <w:tcW w:w="1779" w:type="dxa"/>
-            <w:gridSpan w:val="2"/>
-          </w:tcPr>
-          <w:p>
-            <w:pPr>
-              <w:jc w:val="center"/>
-              <w:rPr>
-                <w:sz w:val="28"/>
-                <w:szCs w:val="28"/>
-                <w:bdr w:val="single" w:sz="4" w:space="0" w:color="auto"/>
-              </w:rPr>
-            </w:pPr>
-            <w:proofErr w:type="spellStart"/>
-            <w:r>
-              <w:rPr>
-                <w:sz w:val="28"/>
-                <w:szCs w:val="28"/>
-                <w:bdr w:val="single" w:sz="4" w:space="0" w:color="auto"/>
-              </w:rPr>
-              <w:t>Jumlah</w:t>
-            </w:r>
-            <w:proofErr w:type="spellEnd"/>
-          </w:p>
-        </w:tc>
-        <w:tc>
-          <w:tcPr>
-            <w:tcW w:w="7520" w:type="dxa"/>
-            <w:gridSpan w:val="7"/>
+            <w:tcW w:w="1476" w:type="dxa"/>
           </w:tcPr>
           <w:p>
             <w:pPr>
@@ -1438,10 +1041,7 @@
       </w:r>
       <w:proofErr w:type="spellEnd"/>
       <w:r>
-        <w:t xml:space="preserve"> Barang/Pengurus </w:t>
-      </w:r>
-      <w:r>
-        <w:t>Barang</w:t>
+        <w:t xml:space="preserve"> Barang/Pengurus Barang</w:t>
       </w:r>
     </w:p>
     <w:p>

</xml_diff>